<commit_message>
Add Slack app manifest instructions and webhook-test warning to docs
- Added note recommending "From an app manifest" setup method with
  reference to the included manifest_slack_app.json file
- Added warning about using production webhook URLs vs webhook-test
  URLs, which only work during manual n8n test executions
</commit_message>
<xml_diff>
--- a/Travel_AI_Slack_Solution/Travel Agency Slack Bot Solution Documentation VER 3.0.docx
+++ b/Travel_AI_Slack_Solution/Travel Agency Slack Bot Solution Documentation VER 3.0.docx
@@ -586,7 +586,51 @@
           <w:color w:val="434343"/>
           <w:rtl w:val="0"/>
         </w:rPr>
-        <w:t xml:space="preserve">Select "From scratch"</w:t>
+        <w:t xml:space="preserve">Select "From an app manifest" (Recommended)</w:t>
+      </w:r>
+      <w:r>
+        <w:rPr>
+          <w:color w:val="434343"/>
+          <w:rtl w:val="0"/>
+        </w:rPr>
+        <w:t xml:space="preserve"> — Use the provided manifest_slack_app.json file from the Slack App Manifest folder. This will pre-configure all bot scopes, event subscriptions, slash commands, and shortcuts in one step. You will still need to update the placeholder webhook URLs in the manifest to point to your n8n instance before importing.</w:t>
+      </w:r>
+    </w:p>
+    <w:p>
+      <w:pPr>
+        <w:spacing w:before="120" w:after="120" w:lineRule="auto"/>
+        <w:ind w:left="720"/>
+        <w:rPr>
+          <w:color w:val="434343"/>
+        </w:rPr>
+      </w:pPr>
+      <w:r>
+        <w:rPr>
+          <w:color w:val="434343"/>
+          <w:rtl w:val="0"/>
+        </w:rPr>
+        <w:t xml:space="preserve">⚠️ IMPORTANT: When configuring webhook URLs in the manifest or in Slack, always use your n8n production webhook URLs (e.g., https://your-instance.app.n8n.cloud/webhook/...). Do not use test URLs (webhook-test) — these only work during manual n8n test executions and will silently fail in production.</w:t>
+      </w:r>
+    </w:p>
+    <w:p>
+      <w:pPr>
+        <w:numPr>
+          <w:ilvl w:val="0"/>
+          <w:numId w:val="48"/>
+        </w:numPr>
+        <w:ind w:left="720" w:hanging="360"/>
+        <w:rPr>
+          <w:color w:val="434343"/>
+        </w:rPr>
+      </w:pPr>
+      <w:r>
+        <w:rPr>
+          <w:b w:val="1"/>
+          <w:bCs w:val="1"/>
+          <w:color w:val="434343"/>
+          <w:rtl w:val="0"/>
+        </w:rPr>
+        <w:t xml:space="preserve">Alternatively, select "From scratch"</w:t>
       </w:r>
       <w:r>
         <w:rPr>

</xml_diff>